<commit_message>
docs: tài liệu chỉ trình bày SQL Server, bỏ phần đối chiếu hai hệ
Theo yêu cầu của nhóm, bộ tài liệu nộp (Markdown và Word) không còn nhắc
tới SQLite:
- Phần 5, 10: bỏ đoạn so sánh cú pháp và trigger
- Phần 11: mục "Tương ứng trong ứng dụng" chỉ còn bảng đối tượng ↔ chức năng
- Phần 12: bỏ mục đối chiếu SQL Server với SQLite, đánh số lại các mục

Mã nguồn không đổi: ứng dụng vẫn dùng SQLite nhúng và README của repo vẫn
mô tả đúng điều đó.

Co-Authored-By: Claude Opus 5.5 <noreply@anthropic.com>
</commit_message>
<xml_diff>
--- a/docs/word/05_nguoi_dung.docx
+++ b/docs/word/05_nguoi_dung.docx
@@ -4990,7 +4990,7 @@
               <w:pStyle w:val="NoiDungBang"/>
             </w:pPr>
             <w:r>
-              <w:t xml:space="preserve">37</w:t>
+              <w:t xml:space="preserve">27</w:t>
             </w:r>
           </w:p>
         </w:tc>
@@ -5034,7 +5034,7 @@
               <w:pStyle w:val="NoiDungBang"/>
             </w:pPr>
             <w:r>
-              <w:t xml:space="preserve">2026-10-12 18:54:06</w:t>
+              <w:t xml:space="preserve">2026-10-12 19:14:04</w:t>
             </w:r>
           </w:p>
         </w:tc>
@@ -11535,53 +11535,6 @@
         </w:tc>
       </w:tr>
     </w:tbl>
-    <w:p>
-      <w:pPr>
-        <w:pStyle w:val="FirstParagraph"/>
-      </w:pPr>
-      <w:r>
-        <w:t xml:space="preserve">Ứng dụng dùng SQLite nên câu lệnh được viết lại theo cú pháp SQLite trong</w:t>
-      </w:r>
-      <w:r>
-        <w:t xml:space="preserve"> </w:t>
-      </w:r>
-      <w:r>
-        <w:rPr>
-          <w:rStyle w:val="VerbatimChar"/>
-        </w:rPr>
-        <w:t xml:space="preserve">lib/features/ho_so/data/repository_impl/sqlite_ho_so_repository.dart</w:t>
-      </w:r>
-      <w:r>
-        <w:t xml:space="preserve">; việc tìm không dấu dùng hàm</w:t>
-      </w:r>
-      <w:r>
-        <w:t xml:space="preserve"> </w:t>
-      </w:r>
-      <w:r>
-        <w:rPr>
-          <w:rStyle w:val="VerbatimChar"/>
-        </w:rPr>
-        <w:t xml:space="preserve">bo_dau()</w:t>
-      </w:r>
-      <w:r>
-        <w:t xml:space="preserve"> </w:t>
-      </w:r>
-      <w:r>
-        <w:t xml:space="preserve">do ứng dụng đăng ký thay cho</w:t>
-      </w:r>
-      <w:r>
-        <w:t xml:space="preserve"> </w:t>
-      </w:r>
-      <w:r>
-        <w:rPr>
-          <w:rStyle w:val="VerbatimChar"/>
-        </w:rPr>
-        <w:t xml:space="preserve">COLLATE Latin1_General_CI_AI</w:t>
-      </w:r>
-      <w:r>
-        <w:t xml:space="preserve">.</w:t>
-      </w:r>
-    </w:p>
     <w:sectPr>
       <w:footnotePr>
         <w:numRestart w:val="eachSect"/>

</xml_diff>